<commit_message>
Refine role title and certification milestones
</commit_message>
<xml_diff>
--- a/Joshua Leslie Resume.docx
+++ b/Joshua Leslie Resume.docx
@@ -50,7 +50,7 @@
                 <w:color w:val="4B5563"/>
                 <w:sz w:val="22"/>
               </w:rPr>
-              <w:t>IT Support Engineer | Cybersecurity</w:t>
+              <w:t>IT Technician Level 2 | Cybersecurity</w:t>
             </w:r>
           </w:p>
           <w:p>
@@ -243,7 +243,7 @@
           <w:color w:val="111827"/>
           <w:sz w:val="18"/>
         </w:rPr>
-        <w:t>IT Support Engineer at Think Unified supporting multi-client environments across Active Directory, Microsoft 365 security, firewalls, VPNs, endpoint management, patching, backup and disaster recovery, and remote monitoring.</w:t>
+        <w:t>IT Technician Level 2 at Think Unified supporting multi-client environments across Active Directory, Microsoft 365 security, firewalls, VPNs, endpoint management, patching, backup and disaster recovery, and remote monitoring.</w:t>
       </w:r>
     </w:p>
     <w:p>
@@ -300,7 +300,7 @@
           <w:color w:val="111827"/>
           <w:sz w:val="20"/>
         </w:rPr>
-        <w:t>IT Support Engineer</w:t>
+        <w:t>IT Technician Level 2</w:t>
       </w:r>
       <w:r>
         <w:rPr>
@@ -587,7 +587,7 @@
           <w:color w:val="111827"/>
           <w:sz w:val="18"/>
         </w:rPr>
-        <w:t xml:space="preserve">CompTIA Network+ - Verified credential - </w:t>
+        <w:t xml:space="preserve">CompTIA Network+ - Passed 5/23/26 - </w:t>
       </w:r>
       <w:hyperlink r:id="rId11">
         <w:r>
@@ -823,6 +823,20 @@
                 <w:sz w:val="18"/>
               </w:rPr>
               <w:t>CyberDefenders</w:t>
+            </w:r>
+          </w:p>
+          <w:p>
+            <w:pPr>
+              <w:pStyle w:val="ListBullet"/>
+              <w:spacing w:after="0"/>
+            </w:pPr>
+            <w:r>
+              <w:rPr>
+                <w:rFonts w:ascii="Cambria" w:hAnsi="Cambria"/>
+                <w:color w:val="111827"/>
+                <w:sz w:val="18"/>
+              </w:rPr>
+              <w:t>Plan to take CompTIA CySA+ by end of August</w:t>
             </w:r>
           </w:p>
           <w:p>

</xml_diff>